<commit_message>
fix: enforce DOCX report consistency contracts
</commit_message>
<xml_diff>
--- a/05_交付物/通俗细分版_2026-08-07/01_学术写作引用与出版/01-03_摘要、关键词与篇幅压缩/01-03_摘要、关键词与篇幅压缩_GitHub技能调研.docx
+++ b/05_交付物/通俗细分版_2026-08-07/01_学术写作引用与出版/01-03_摘要、关键词与篇幅压缩/01-03_摘要、关键词与篇幅压缩_GitHub技能调研.docx
@@ -209,7 +209,7 @@
                 <w:b/>
                 <w:i w:val="0"/>
                 <w:color w:val="243447"/>
-                <w:sz w:val="19"/>
+                <w:sz w:val="22"/>
               </w:rPr>
               <w:t>英文名称</w:t>
             </w:r>
@@ -239,7 +239,7 @@
                 <w:b w:val="0"/>
                 <w:i w:val="0"/>
                 <w:color w:val="243447"/>
-                <w:sz w:val="19"/>
+                <w:sz w:val="22"/>
               </w:rPr>
               <w:t>write-abstract</w:t>
             </w:r>
@@ -275,7 +275,7 @@
                 <w:b/>
                 <w:i w:val="0"/>
                 <w:color w:val="243447"/>
-                <w:sz w:val="19"/>
+                <w:sz w:val="22"/>
               </w:rPr>
               <w:t>推荐程度</w:t>
             </w:r>
@@ -305,7 +305,7 @@
                 <w:b w:val="0"/>
                 <w:i w:val="0"/>
                 <w:color w:val="243447"/>
-                <w:sz w:val="19"/>
+                <w:sz w:val="22"/>
               </w:rPr>
               <w:t>高</w:t>
             </w:r>
@@ -341,7 +341,7 @@
                 <w:b/>
                 <w:i w:val="0"/>
                 <w:color w:val="243447"/>
-                <w:sz w:val="19"/>
+                <w:sz w:val="22"/>
               </w:rPr>
               <w:t>接入难度</w:t>
             </w:r>
@@ -371,7 +371,7 @@
                 <w:b w:val="0"/>
                 <w:i w:val="0"/>
                 <w:color w:val="243447"/>
-                <w:sz w:val="19"/>
+                <w:sz w:val="22"/>
               </w:rPr>
               <w:t>中</w:t>
             </w:r>
@@ -406,7 +406,7 @@
                 <w:b/>
                 <w:i w:val="0"/>
                 <w:color w:val="243447"/>
-                <w:sz w:val="19"/>
+                <w:sz w:val="22"/>
               </w:rPr>
               <w:t>核验层级</w:t>
             </w:r>
@@ -435,7 +435,7 @@
                 <w:b w:val="0"/>
                 <w:i w:val="0"/>
                 <w:color w:val="243447"/>
-                <w:sz w:val="19"/>
+                <w:sz w:val="22"/>
               </w:rPr>
               <w:t>说明已核验</w:t>
             </w:r>
@@ -662,7 +662,7 @@
           <w:b/>
           <w:i w:val="0"/>
           <w:color w:val="203748"/>
-          <w:sz w:val="17"/>
+          <w:sz w:val="22"/>
         </w:rPr>
         <w:t>内部编号：</w:t>
       </w:r>
@@ -672,7 +672,7 @@
           <w:b w:val="0"/>
           <w:i w:val="0"/>
           <w:color w:val="243447"/>
-          <w:sz w:val="17"/>
+          <w:sz w:val="22"/>
         </w:rPr>
         <w:t>GH-01-0008</w:t>
       </w:r>
@@ -682,7 +682,7 @@
           <w:b w:val="0"/>
           <w:i w:val="0"/>
           <w:color w:val="5B6775"/>
-          <w:sz w:val="17"/>
+          <w:sz w:val="22"/>
         </w:rPr>
         <w:t xml:space="preserve">； </w:t>
       </w:r>
@@ -692,7 +692,7 @@
           <w:b/>
           <w:i w:val="0"/>
           <w:color w:val="203748"/>
-          <w:sz w:val="17"/>
+          <w:sz w:val="22"/>
         </w:rPr>
         <w:t>功能标签：</w:t>
       </w:r>
@@ -702,7 +702,7 @@
           <w:b w:val="0"/>
           <w:i w:val="0"/>
           <w:color w:val="243447"/>
-          <w:sz w:val="17"/>
+          <w:sz w:val="22"/>
         </w:rPr>
         <w:t>摘要、关键词、字数限制、摘要注册</w:t>
       </w:r>
@@ -712,7 +712,7 @@
           <w:b w:val="0"/>
           <w:i w:val="0"/>
           <w:color w:val="5B6775"/>
-          <w:sz w:val="17"/>
+          <w:sz w:val="22"/>
         </w:rPr>
         <w:t xml:space="preserve">； </w:t>
       </w:r>
@@ -722,7 +722,7 @@
           <w:b/>
           <w:i w:val="0"/>
           <w:color w:val="203748"/>
-          <w:sz w:val="17"/>
+          <w:sz w:val="22"/>
         </w:rPr>
         <w:t>原生生态：</w:t>
       </w:r>
@@ -732,7 +732,7 @@
           <w:b w:val="0"/>
           <w:i w:val="0"/>
           <w:color w:val="243447"/>
-          <w:sz w:val="17"/>
+          <w:sz w:val="22"/>
         </w:rPr>
         <w:t>Agent Skills</w:t>
       </w:r>
@@ -742,7 +742,7 @@
           <w:b w:val="0"/>
           <w:i w:val="0"/>
           <w:color w:val="5B6775"/>
-          <w:sz w:val="17"/>
+          <w:sz w:val="22"/>
         </w:rPr>
         <w:t xml:space="preserve">； </w:t>
       </w:r>
@@ -752,7 +752,7 @@
           <w:b/>
           <w:i w:val="0"/>
           <w:color w:val="203748"/>
-          <w:sz w:val="17"/>
+          <w:sz w:val="22"/>
         </w:rPr>
         <w:t>来源形态：</w:t>
       </w:r>
@@ -762,7 +762,7 @@
           <w:b w:val="0"/>
           <w:i w:val="0"/>
           <w:color w:val="243447"/>
-          <w:sz w:val="17"/>
+          <w:sz w:val="22"/>
         </w:rPr>
         <w:t>社区 skill、开源仓库</w:t>
       </w:r>
@@ -772,7 +772,7 @@
           <w:b w:val="0"/>
           <w:i w:val="0"/>
           <w:color w:val="5B6775"/>
-          <w:sz w:val="17"/>
+          <w:sz w:val="22"/>
         </w:rPr>
         <w:t xml:space="preserve">； </w:t>
       </w:r>
@@ -782,7 +782,7 @@
           <w:b/>
           <w:i w:val="0"/>
           <w:color w:val="203748"/>
-          <w:sz w:val="17"/>
+          <w:sz w:val="22"/>
         </w:rPr>
         <w:t>许可证：</w:t>
       </w:r>
@@ -792,7 +792,7 @@
           <w:b w:val="0"/>
           <w:i w:val="0"/>
           <w:color w:val="243447"/>
-          <w:sz w:val="17"/>
+          <w:sz w:val="22"/>
         </w:rPr>
         <w:t>Apache-2.0</w:t>
       </w:r>
@@ -802,7 +802,7 @@
           <w:b w:val="0"/>
           <w:i w:val="0"/>
           <w:color w:val="5B6775"/>
-          <w:sz w:val="17"/>
+          <w:sz w:val="22"/>
         </w:rPr>
         <w:t xml:space="preserve">； </w:t>
       </w:r>
@@ -812,7 +812,7 @@
           <w:b/>
           <w:i w:val="0"/>
           <w:color w:val="203748"/>
-          <w:sz w:val="17"/>
+          <w:sz w:val="22"/>
         </w:rPr>
         <w:t>仓库最近更新：</w:t>
       </w:r>
@@ -822,7 +822,7 @@
           <w:b w:val="0"/>
           <w:i w:val="0"/>
           <w:color w:val="243447"/>
-          <w:sz w:val="17"/>
+          <w:sz w:val="22"/>
         </w:rPr>
         <w:t>2026-06-27</w:t>
       </w:r>
@@ -832,7 +832,7 @@
           <w:b/>
           <w:i w:val="0"/>
           <w:color w:val="203748"/>
-          <w:sz w:val="17"/>
+          <w:sz w:val="22"/>
         </w:rPr>
         <w:t>； 原始资料地址：</w:t>
       </w:r>
@@ -842,7 +842,8 @@
             <w:rFonts w:ascii="Calibri" w:hAnsi="Calibri" w:eastAsia="Microsoft YaHei"/>
             <w:color w:val="1F5F8B"/>
             <w:u w:val="single"/>
-            <w:sz w:val="17"/>
+            <w:sz w:val="22"/>
+            <w:szCs w:val="22"/>
           </w:rPr>
           <w:t>Skill 说明页</w:t>
         </w:r>
@@ -853,7 +854,7 @@
           <w:b w:val="0"/>
           <w:i w:val="0"/>
           <w:color w:val="5B6775"/>
-          <w:sz w:val="17"/>
+          <w:sz w:val="22"/>
         </w:rPr>
         <w:t xml:space="preserve"> | </w:t>
       </w:r>
@@ -863,7 +864,8 @@
             <w:rFonts w:ascii="Calibri" w:hAnsi="Calibri" w:eastAsia="Microsoft YaHei"/>
             <w:color w:val="1F5F8B"/>
             <w:u w:val="single"/>
-            <w:sz w:val="17"/>
+            <w:sz w:val="22"/>
+            <w:szCs w:val="22"/>
           </w:rPr>
           <w:t>GitHub 仓库</w:t>
         </w:r>

</xml_diff>